<commit_message>
Added a photos folder
</commit_message>
<xml_diff>
--- a/Writeup/NEA_writeup.docx
+++ b/Writeup/NEA_writeup.docx
@@ -50,7 +50,6 @@
             <w:rPr>
               <w:rFonts w:eastAsiaTheme="minorEastAsia"/>
               <w:noProof/>
-              <w:color w:val="000000" w:themeColor="text1"/>
               <w:lang w:eastAsia="en-GB"/>
             </w:rPr>
           </w:pPr>
@@ -72,12 +71,11 @@
             </w:rPr>
             <w:fldChar w:fldCharType="separate"/>
           </w:r>
-          <w:hyperlink w:anchor="_Toc208391581" w:history="1">
+          <w:hyperlink w:anchor="_Toc209599357" w:history="1">
             <w:r>
               <w:rPr>
                 <w:rStyle w:val="Hyperlink"/>
                 <w:noProof/>
-                <w:color w:val="000000" w:themeColor="text1"/>
                 <w:kern w:val="0"/>
                 <w:lang w:eastAsia="en-GB"/>
                 <w14:ligatures w14:val="none"/>
@@ -88,7 +86,6 @@
               <w:rPr>
                 <w:noProof/>
                 <w:webHidden/>
-                <w:color w:val="000000" w:themeColor="text1"/>
               </w:rPr>
               <w:tab/>
             </w:r>
@@ -96,7 +93,6 @@
               <w:rPr>
                 <w:noProof/>
                 <w:webHidden/>
-                <w:color w:val="000000" w:themeColor="text1"/>
               </w:rPr>
               <w:fldChar w:fldCharType="begin"/>
             </w:r>
@@ -104,22 +100,19 @@
               <w:rPr>
                 <w:noProof/>
                 <w:webHidden/>
-                <w:color w:val="000000" w:themeColor="text1"/>
-              </w:rPr>
-              <w:instrText xml:space="preserve"> PAGEREF _Toc208391581 \h </w:instrText>
-            </w:r>
-            <w:r>
-              <w:rPr>
-                <w:noProof/>
-                <w:webHidden/>
-                <w:color w:val="000000" w:themeColor="text1"/>
-              </w:rPr>
-            </w:r>
-            <w:r>
-              <w:rPr>
-                <w:noProof/>
-                <w:webHidden/>
-                <w:color w:val="000000" w:themeColor="text1"/>
+              </w:rPr>
+              <w:instrText xml:space="preserve"> PAGEREF _Toc209599357 \h </w:instrText>
+            </w:r>
+            <w:r>
+              <w:rPr>
+                <w:noProof/>
+                <w:webHidden/>
+              </w:rPr>
+            </w:r>
+            <w:r>
+              <w:rPr>
+                <w:noProof/>
+                <w:webHidden/>
               </w:rPr>
               <w:fldChar w:fldCharType="separate"/>
             </w:r>
@@ -127,7 +120,6 @@
               <w:rPr>
                 <w:noProof/>
                 <w:webHidden/>
-                <w:color w:val="000000" w:themeColor="text1"/>
               </w:rPr>
               <w:t>1</w:t>
             </w:r>
@@ -135,7 +127,6 @@
               <w:rPr>
                 <w:noProof/>
                 <w:webHidden/>
-                <w:color w:val="000000" w:themeColor="text1"/>
               </w:rPr>
               <w:fldChar w:fldCharType="end"/>
             </w:r>
@@ -150,16 +141,14 @@
             <w:rPr>
               <w:rFonts w:eastAsiaTheme="minorEastAsia"/>
               <w:noProof/>
-              <w:color w:val="000000" w:themeColor="text1"/>
               <w:lang w:eastAsia="en-GB"/>
             </w:rPr>
           </w:pPr>
-          <w:hyperlink w:anchor="_Toc208391582" w:history="1">
+          <w:hyperlink w:anchor="_Toc209599358" w:history="1">
             <w:r>
               <w:rPr>
                 <w:rStyle w:val="Hyperlink"/>
                 <w:noProof/>
-                <w:color w:val="000000" w:themeColor="text1"/>
               </w:rPr>
               <w:t>Aim</w:t>
             </w:r>
@@ -167,7 +156,6 @@
               <w:rPr>
                 <w:noProof/>
                 <w:webHidden/>
-                <w:color w:val="000000" w:themeColor="text1"/>
               </w:rPr>
               <w:tab/>
             </w:r>
@@ -175,7 +163,6 @@
               <w:rPr>
                 <w:noProof/>
                 <w:webHidden/>
-                <w:color w:val="000000" w:themeColor="text1"/>
               </w:rPr>
               <w:fldChar w:fldCharType="begin"/>
             </w:r>
@@ -183,22 +170,19 @@
               <w:rPr>
                 <w:noProof/>
                 <w:webHidden/>
-                <w:color w:val="000000" w:themeColor="text1"/>
-              </w:rPr>
-              <w:instrText xml:space="preserve"> PAGEREF _Toc208391582 \h </w:instrText>
-            </w:r>
-            <w:r>
-              <w:rPr>
-                <w:noProof/>
-                <w:webHidden/>
-                <w:color w:val="000000" w:themeColor="text1"/>
-              </w:rPr>
-            </w:r>
-            <w:r>
-              <w:rPr>
-                <w:noProof/>
-                <w:webHidden/>
-                <w:color w:val="000000" w:themeColor="text1"/>
+              </w:rPr>
+              <w:instrText xml:space="preserve"> PAGEREF _Toc209599358 \h </w:instrText>
+            </w:r>
+            <w:r>
+              <w:rPr>
+                <w:noProof/>
+                <w:webHidden/>
+              </w:rPr>
+            </w:r>
+            <w:r>
+              <w:rPr>
+                <w:noProof/>
+                <w:webHidden/>
               </w:rPr>
               <w:fldChar w:fldCharType="separate"/>
             </w:r>
@@ -206,7 +190,6 @@
               <w:rPr>
                 <w:noProof/>
                 <w:webHidden/>
-                <w:color w:val="000000" w:themeColor="text1"/>
               </w:rPr>
               <w:t>1</w:t>
             </w:r>
@@ -214,7 +197,6 @@
               <w:rPr>
                 <w:noProof/>
                 <w:webHidden/>
-                <w:color w:val="000000" w:themeColor="text1"/>
               </w:rPr>
               <w:fldChar w:fldCharType="end"/>
             </w:r>
@@ -229,16 +211,14 @@
             <w:rPr>
               <w:rFonts w:eastAsiaTheme="minorEastAsia"/>
               <w:noProof/>
-              <w:color w:val="000000" w:themeColor="text1"/>
               <w:lang w:eastAsia="en-GB"/>
             </w:rPr>
           </w:pPr>
-          <w:hyperlink w:anchor="_Toc208391583" w:history="1">
+          <w:hyperlink w:anchor="_Toc209599359" w:history="1">
             <w:r>
               <w:rPr>
                 <w:rStyle w:val="Hyperlink"/>
                 <w:noProof/>
-                <w:color w:val="000000" w:themeColor="text1"/>
               </w:rPr>
               <w:t>Research</w:t>
             </w:r>
@@ -246,7 +226,6 @@
               <w:rPr>
                 <w:noProof/>
                 <w:webHidden/>
-                <w:color w:val="000000" w:themeColor="text1"/>
               </w:rPr>
               <w:tab/>
             </w:r>
@@ -254,7 +233,6 @@
               <w:rPr>
                 <w:noProof/>
                 <w:webHidden/>
-                <w:color w:val="000000" w:themeColor="text1"/>
               </w:rPr>
               <w:fldChar w:fldCharType="begin"/>
             </w:r>
@@ -262,22 +240,19 @@
               <w:rPr>
                 <w:noProof/>
                 <w:webHidden/>
-                <w:color w:val="000000" w:themeColor="text1"/>
-              </w:rPr>
-              <w:instrText xml:space="preserve"> PAGEREF _Toc208391583 \h </w:instrText>
-            </w:r>
-            <w:r>
-              <w:rPr>
-                <w:noProof/>
-                <w:webHidden/>
-                <w:color w:val="000000" w:themeColor="text1"/>
-              </w:rPr>
-            </w:r>
-            <w:r>
-              <w:rPr>
-                <w:noProof/>
-                <w:webHidden/>
-                <w:color w:val="000000" w:themeColor="text1"/>
+              </w:rPr>
+              <w:instrText xml:space="preserve"> PAGEREF _Toc209599359 \h </w:instrText>
+            </w:r>
+            <w:r>
+              <w:rPr>
+                <w:noProof/>
+                <w:webHidden/>
+              </w:rPr>
+            </w:r>
+            <w:r>
+              <w:rPr>
+                <w:noProof/>
+                <w:webHidden/>
               </w:rPr>
               <w:fldChar w:fldCharType="separate"/>
             </w:r>
@@ -285,15 +260,13 @@
               <w:rPr>
                 <w:noProof/>
                 <w:webHidden/>
-                <w:color w:val="000000" w:themeColor="text1"/>
-              </w:rPr>
-              <w:t>1</w:t>
-            </w:r>
-            <w:r>
-              <w:rPr>
-                <w:noProof/>
-                <w:webHidden/>
-                <w:color w:val="000000" w:themeColor="text1"/>
+              </w:rPr>
+              <w:t>2</w:t>
+            </w:r>
+            <w:r>
+              <w:rPr>
+                <w:noProof/>
+                <w:webHidden/>
               </w:rPr>
               <w:fldChar w:fldCharType="end"/>
             </w:r>
@@ -308,16 +281,14 @@
             <w:rPr>
               <w:rFonts w:eastAsiaTheme="minorEastAsia"/>
               <w:noProof/>
-              <w:color w:val="000000" w:themeColor="text1"/>
               <w:lang w:eastAsia="en-GB"/>
             </w:rPr>
           </w:pPr>
-          <w:hyperlink w:anchor="_Toc208391584" w:history="1">
+          <w:hyperlink w:anchor="_Toc209599360" w:history="1">
             <w:r>
               <w:rPr>
                 <w:rStyle w:val="Hyperlink"/>
                 <w:noProof/>
-                <w:color w:val="000000" w:themeColor="text1"/>
               </w:rPr>
               <w:t>Outlook</w:t>
             </w:r>
@@ -325,7 +296,6 @@
               <w:rPr>
                 <w:noProof/>
                 <w:webHidden/>
-                <w:color w:val="000000" w:themeColor="text1"/>
               </w:rPr>
               <w:tab/>
             </w:r>
@@ -333,7 +303,6 @@
               <w:rPr>
                 <w:noProof/>
                 <w:webHidden/>
-                <w:color w:val="000000" w:themeColor="text1"/>
               </w:rPr>
               <w:fldChar w:fldCharType="begin"/>
             </w:r>
@@ -341,22 +310,19 @@
               <w:rPr>
                 <w:noProof/>
                 <w:webHidden/>
-                <w:color w:val="000000" w:themeColor="text1"/>
-              </w:rPr>
-              <w:instrText xml:space="preserve"> PAGEREF _Toc208391584 \h </w:instrText>
-            </w:r>
-            <w:r>
-              <w:rPr>
-                <w:noProof/>
-                <w:webHidden/>
-                <w:color w:val="000000" w:themeColor="text1"/>
-              </w:rPr>
-            </w:r>
-            <w:r>
-              <w:rPr>
-                <w:noProof/>
-                <w:webHidden/>
-                <w:color w:val="000000" w:themeColor="text1"/>
+              </w:rPr>
+              <w:instrText xml:space="preserve"> PAGEREF _Toc209599360 \h </w:instrText>
+            </w:r>
+            <w:r>
+              <w:rPr>
+                <w:noProof/>
+                <w:webHidden/>
+              </w:rPr>
+            </w:r>
+            <w:r>
+              <w:rPr>
+                <w:noProof/>
+                <w:webHidden/>
               </w:rPr>
               <w:fldChar w:fldCharType="separate"/>
             </w:r>
@@ -364,15 +330,13 @@
               <w:rPr>
                 <w:noProof/>
                 <w:webHidden/>
-                <w:color w:val="000000" w:themeColor="text1"/>
-              </w:rPr>
-              <w:t>1</w:t>
-            </w:r>
-            <w:r>
-              <w:rPr>
-                <w:noProof/>
-                <w:webHidden/>
-                <w:color w:val="000000" w:themeColor="text1"/>
+              </w:rPr>
+              <w:t>2</w:t>
+            </w:r>
+            <w:r>
+              <w:rPr>
+                <w:noProof/>
+                <w:webHidden/>
               </w:rPr>
               <w:fldChar w:fldCharType="end"/>
             </w:r>
@@ -387,16 +351,154 @@
             <w:rPr>
               <w:rFonts w:eastAsiaTheme="minorEastAsia"/>
               <w:noProof/>
-              <w:color w:val="000000" w:themeColor="text1"/>
               <w:lang w:eastAsia="en-GB"/>
             </w:rPr>
           </w:pPr>
-          <w:hyperlink w:anchor="_Toc208391585" w:history="1">
+          <w:hyperlink w:anchor="_Toc209599361" w:history="1">
             <w:r>
               <w:rPr>
                 <w:rStyle w:val="Hyperlink"/>
                 <w:noProof/>
-                <w:color w:val="000000" w:themeColor="text1"/>
+              </w:rPr>
+              <w:t>Pre-requisites</w:t>
+            </w:r>
+            <w:r>
+              <w:rPr>
+                <w:noProof/>
+                <w:webHidden/>
+              </w:rPr>
+              <w:tab/>
+            </w:r>
+            <w:r>
+              <w:rPr>
+                <w:noProof/>
+                <w:webHidden/>
+              </w:rPr>
+              <w:fldChar w:fldCharType="begin"/>
+            </w:r>
+            <w:r>
+              <w:rPr>
+                <w:noProof/>
+                <w:webHidden/>
+              </w:rPr>
+              <w:instrText xml:space="preserve"> PAGEREF _Toc209599361 \h </w:instrText>
+            </w:r>
+            <w:r>
+              <w:rPr>
+                <w:noProof/>
+                <w:webHidden/>
+              </w:rPr>
+            </w:r>
+            <w:r>
+              <w:rPr>
+                <w:noProof/>
+                <w:webHidden/>
+              </w:rPr>
+              <w:fldChar w:fldCharType="separate"/>
+            </w:r>
+            <w:r>
+              <w:rPr>
+                <w:noProof/>
+                <w:webHidden/>
+              </w:rPr>
+              <w:t>2</w:t>
+            </w:r>
+            <w:r>
+              <w:rPr>
+                <w:noProof/>
+                <w:webHidden/>
+              </w:rPr>
+              <w:fldChar w:fldCharType="end"/>
+            </w:r>
+          </w:hyperlink>
+        </w:p>
+        <w:p>
+          <w:pPr>
+            <w:pStyle w:val="TOC2"/>
+            <w:tabs>
+              <w:tab w:val="right" w:leader="dot" w:pos="9016"/>
+            </w:tabs>
+            <w:rPr>
+              <w:rFonts w:eastAsiaTheme="minorEastAsia"/>
+              <w:noProof/>
+              <w:lang w:eastAsia="en-GB"/>
+            </w:rPr>
+          </w:pPr>
+          <w:hyperlink w:anchor="_Toc209599362" w:history="1">
+            <w:r>
+              <w:rPr>
+                <w:rStyle w:val="Hyperlink"/>
+                <w:noProof/>
+              </w:rPr>
+              <w:t>Features to include</w:t>
+            </w:r>
+            <w:r>
+              <w:rPr>
+                <w:noProof/>
+                <w:webHidden/>
+              </w:rPr>
+              <w:tab/>
+            </w:r>
+            <w:r>
+              <w:rPr>
+                <w:noProof/>
+                <w:webHidden/>
+              </w:rPr>
+              <w:fldChar w:fldCharType="begin"/>
+            </w:r>
+            <w:r>
+              <w:rPr>
+                <w:noProof/>
+                <w:webHidden/>
+              </w:rPr>
+              <w:instrText xml:space="preserve"> PAGEREF _Toc209599362 \h </w:instrText>
+            </w:r>
+            <w:r>
+              <w:rPr>
+                <w:noProof/>
+                <w:webHidden/>
+              </w:rPr>
+            </w:r>
+            <w:r>
+              <w:rPr>
+                <w:noProof/>
+                <w:webHidden/>
+              </w:rPr>
+              <w:fldChar w:fldCharType="separate"/>
+            </w:r>
+            <w:r>
+              <w:rPr>
+                <w:noProof/>
+                <w:webHidden/>
+              </w:rPr>
+              <w:t>2</w:t>
+            </w:r>
+            <w:r>
+              <w:rPr>
+                <w:noProof/>
+                <w:webHidden/>
+              </w:rPr>
+              <w:fldChar w:fldCharType="end"/>
+            </w:r>
+          </w:hyperlink>
+        </w:p>
+        <w:p>
+          <w:pPr>
+            <w:pStyle w:val="TOC2"/>
+            <w:tabs>
+              <w:tab w:val="right" w:leader="dot" w:pos="9016"/>
+            </w:tabs>
+            <w:rPr>
+              <w:rFonts w:eastAsiaTheme="minorEastAsia"/>
+              <w:noProof/>
+              <w:lang w:eastAsia="en-GB"/>
+            </w:rPr>
+          </w:pPr>
+          <w:hyperlink w:anchor="_Toc209599363" w:history="1">
+            <w:r>
+              <w:rPr>
+                <w:rStyle w:val="Hyperlink"/>
+                <w:noProof/>
               </w:rPr>
               <w:t>Partials solutions</w:t>
             </w:r>
@@ -404,7 +506,6 @@
               <w:rPr>
                 <w:noProof/>
                 <w:webHidden/>
-                <w:color w:val="000000" w:themeColor="text1"/>
               </w:rPr>
               <w:tab/>
             </w:r>
@@ -412,7 +513,6 @@
               <w:rPr>
                 <w:noProof/>
                 <w:webHidden/>
-                <w:color w:val="000000" w:themeColor="text1"/>
               </w:rPr>
               <w:fldChar w:fldCharType="begin"/>
             </w:r>
@@ -420,22 +520,19 @@
               <w:rPr>
                 <w:noProof/>
                 <w:webHidden/>
-                <w:color w:val="000000" w:themeColor="text1"/>
-              </w:rPr>
-              <w:instrText xml:space="preserve"> PAGEREF _Toc208391585 \h </w:instrText>
-            </w:r>
-            <w:r>
-              <w:rPr>
-                <w:noProof/>
-                <w:webHidden/>
-                <w:color w:val="000000" w:themeColor="text1"/>
-              </w:rPr>
-            </w:r>
-            <w:r>
-              <w:rPr>
-                <w:noProof/>
-                <w:webHidden/>
-                <w:color w:val="000000" w:themeColor="text1"/>
+              </w:rPr>
+              <w:instrText xml:space="preserve"> PAGEREF _Toc209599363 \h </w:instrText>
+            </w:r>
+            <w:r>
+              <w:rPr>
+                <w:noProof/>
+                <w:webHidden/>
+              </w:rPr>
+            </w:r>
+            <w:r>
+              <w:rPr>
+                <w:noProof/>
+                <w:webHidden/>
               </w:rPr>
               <w:fldChar w:fldCharType="separate"/>
             </w:r>
@@ -443,7 +540,6 @@
               <w:rPr>
                 <w:noProof/>
                 <w:webHidden/>
-                <w:color w:val="000000" w:themeColor="text1"/>
               </w:rPr>
               <w:t>2</w:t>
             </w:r>
@@ -451,7 +547,216 @@
               <w:rPr>
                 <w:noProof/>
                 <w:webHidden/>
-                <w:color w:val="000000" w:themeColor="text1"/>
+              </w:rPr>
+              <w:fldChar w:fldCharType="end"/>
+            </w:r>
+          </w:hyperlink>
+        </w:p>
+        <w:p>
+          <w:pPr>
+            <w:pStyle w:val="TOC2"/>
+            <w:tabs>
+              <w:tab w:val="right" w:leader="dot" w:pos="9016"/>
+            </w:tabs>
+            <w:rPr>
+              <w:rFonts w:eastAsiaTheme="minorEastAsia"/>
+              <w:noProof/>
+              <w:lang w:eastAsia="en-GB"/>
+            </w:rPr>
+          </w:pPr>
+          <w:hyperlink w:anchor="_Toc209599364" w:history="1">
+            <w:r>
+              <w:rPr>
+                <w:rStyle w:val="Hyperlink"/>
+                <w:noProof/>
+              </w:rPr>
+              <w:t>Libraries</w:t>
+            </w:r>
+            <w:r>
+              <w:rPr>
+                <w:noProof/>
+                <w:webHidden/>
+              </w:rPr>
+              <w:tab/>
+            </w:r>
+            <w:r>
+              <w:rPr>
+                <w:noProof/>
+                <w:webHidden/>
+              </w:rPr>
+              <w:fldChar w:fldCharType="begin"/>
+            </w:r>
+            <w:r>
+              <w:rPr>
+                <w:noProof/>
+                <w:webHidden/>
+              </w:rPr>
+              <w:instrText xml:space="preserve"> PAGEREF _Toc209599364 \h </w:instrText>
+            </w:r>
+            <w:r>
+              <w:rPr>
+                <w:noProof/>
+                <w:webHidden/>
+              </w:rPr>
+            </w:r>
+            <w:r>
+              <w:rPr>
+                <w:noProof/>
+                <w:webHidden/>
+              </w:rPr>
+              <w:fldChar w:fldCharType="separate"/>
+            </w:r>
+            <w:r>
+              <w:rPr>
+                <w:noProof/>
+                <w:webHidden/>
+              </w:rPr>
+              <w:t>3</w:t>
+            </w:r>
+            <w:r>
+              <w:rPr>
+                <w:noProof/>
+                <w:webHidden/>
+              </w:rPr>
+              <w:fldChar w:fldCharType="end"/>
+            </w:r>
+          </w:hyperlink>
+        </w:p>
+        <w:p>
+          <w:pPr>
+            <w:pStyle w:val="TOC2"/>
+            <w:tabs>
+              <w:tab w:val="right" w:leader="dot" w:pos="9016"/>
+            </w:tabs>
+            <w:rPr>
+              <w:rFonts w:eastAsiaTheme="minorEastAsia"/>
+              <w:noProof/>
+              <w:lang w:eastAsia="en-GB"/>
+            </w:rPr>
+          </w:pPr>
+          <w:hyperlink w:anchor="_Toc209599365" w:history="1">
+            <w:r>
+              <w:rPr>
+                <w:rStyle w:val="Hyperlink"/>
+                <w:noProof/>
+              </w:rPr>
+              <w:t>Stakeholders</w:t>
+            </w:r>
+            <w:r>
+              <w:rPr>
+                <w:noProof/>
+                <w:webHidden/>
+              </w:rPr>
+              <w:tab/>
+            </w:r>
+            <w:r>
+              <w:rPr>
+                <w:noProof/>
+                <w:webHidden/>
+              </w:rPr>
+              <w:fldChar w:fldCharType="begin"/>
+            </w:r>
+            <w:r>
+              <w:rPr>
+                <w:noProof/>
+                <w:webHidden/>
+              </w:rPr>
+              <w:instrText xml:space="preserve"> PAGEREF _Toc209599365 \h </w:instrText>
+            </w:r>
+            <w:r>
+              <w:rPr>
+                <w:noProof/>
+                <w:webHidden/>
+              </w:rPr>
+            </w:r>
+            <w:r>
+              <w:rPr>
+                <w:noProof/>
+                <w:webHidden/>
+              </w:rPr>
+              <w:fldChar w:fldCharType="separate"/>
+            </w:r>
+            <w:r>
+              <w:rPr>
+                <w:noProof/>
+                <w:webHidden/>
+              </w:rPr>
+              <w:t>3</w:t>
+            </w:r>
+            <w:r>
+              <w:rPr>
+                <w:noProof/>
+                <w:webHidden/>
+              </w:rPr>
+              <w:fldChar w:fldCharType="end"/>
+            </w:r>
+          </w:hyperlink>
+        </w:p>
+        <w:p>
+          <w:pPr>
+            <w:pStyle w:val="TOC1"/>
+            <w:tabs>
+              <w:tab w:val="right" w:leader="dot" w:pos="9016"/>
+            </w:tabs>
+            <w:rPr>
+              <w:rFonts w:eastAsiaTheme="minorEastAsia"/>
+              <w:noProof/>
+              <w:lang w:eastAsia="en-GB"/>
+            </w:rPr>
+          </w:pPr>
+          <w:hyperlink w:anchor="_Toc209599366" w:history="1">
+            <w:r>
+              <w:rPr>
+                <w:rStyle w:val="Hyperlink"/>
+                <w:noProof/>
+              </w:rPr>
+              <w:t>References:</w:t>
+            </w:r>
+            <w:r>
+              <w:rPr>
+                <w:noProof/>
+                <w:webHidden/>
+              </w:rPr>
+              <w:tab/>
+            </w:r>
+            <w:r>
+              <w:rPr>
+                <w:noProof/>
+                <w:webHidden/>
+              </w:rPr>
+              <w:fldChar w:fldCharType="begin"/>
+            </w:r>
+            <w:r>
+              <w:rPr>
+                <w:noProof/>
+                <w:webHidden/>
+              </w:rPr>
+              <w:instrText xml:space="preserve"> PAGEREF _Toc209599366 \h </w:instrText>
+            </w:r>
+            <w:r>
+              <w:rPr>
+                <w:noProof/>
+                <w:webHidden/>
+              </w:rPr>
+            </w:r>
+            <w:r>
+              <w:rPr>
+                <w:noProof/>
+                <w:webHidden/>
+              </w:rPr>
+              <w:fldChar w:fldCharType="separate"/>
+            </w:r>
+            <w:r>
+              <w:rPr>
+                <w:noProof/>
+                <w:webHidden/>
+              </w:rPr>
+              <w:t>3</w:t>
+            </w:r>
+            <w:r>
+              <w:rPr>
+                <w:noProof/>
+                <w:webHidden/>
               </w:rPr>
               <w:fldChar w:fldCharType="end"/>
             </w:r>
@@ -493,7 +798,7 @@
           <w:szCs w:val="28"/>
         </w:rPr>
       </w:pPr>
-      <w:bookmarkStart w:id="0" w:name="_Toc208391581"/>
+      <w:bookmarkStart w:id="0" w:name="_Toc209599357"/>
       <w:r>
         <w:rPr>
           <w:rStyle w:val="Heading1Char"/>
@@ -531,48 +836,112 @@
         <w:rPr>
           <w:rFonts w:ascii="Calibri" w:hAnsi="Calibri" w:cs="Calibri"/>
           <w:color w:val="000000"/>
-          <w:sz w:val="28"/>
-          <w:szCs w:val="28"/>
-        </w:rPr>
-      </w:pPr>
-      <w:r>
+        </w:rPr>
+      </w:pPr>
+      <w:r>
+        <w:rPr>
+          <w:rFonts w:ascii="Calibri" w:hAnsi="Calibri" w:cs="Calibri"/>
+          <w:color w:val="000000"/>
+        </w:rPr>
+        <w:t xml:space="preserve">Rust based </w:t>
+      </w:r>
+      <w:r>
+        <w:rPr>
+          <w:rFonts w:ascii="Calibri" w:hAnsi="Calibri" w:cs="Calibri"/>
+          <w:color w:val="000000"/>
+        </w:rPr>
+        <w:t xml:space="preserve">block </w:t>
+      </w:r>
+      <w:r>
+        <w:rPr>
+          <w:rFonts w:ascii="Calibri" w:hAnsi="Calibri" w:cs="Calibri"/>
+          <w:color w:val="000000"/>
+        </w:rPr>
+        <w:t>c</w:t>
+      </w:r>
+      <w:r>
+        <w:rPr>
+          <w:rFonts w:ascii="Calibri" w:hAnsi="Calibri" w:cs="Calibri"/>
+          <w:color w:val="000000"/>
+        </w:rPr>
+        <w:t xml:space="preserve">ode </w:t>
+      </w:r>
+      <w:r>
+        <w:rPr>
+          <w:rFonts w:ascii="Calibri" w:hAnsi="Calibri" w:cs="Calibri"/>
+          <w:color w:val="000000"/>
+        </w:rPr>
+        <w:t xml:space="preserve">editor: A coding editor that is written 100% in </w:t>
+      </w:r>
+      <w:r>
+        <w:rPr>
+          <w:rFonts w:ascii="Calibri" w:hAnsi="Calibri" w:cs="Calibri"/>
+          <w:color w:val="000000"/>
+        </w:rPr>
+        <w:t>Rust</w:t>
+      </w:r>
+      <w:r>
+        <w:rPr>
+          <w:rFonts w:ascii="Calibri" w:hAnsi="Calibri" w:cs="Calibri"/>
+          <w:color w:val="000000"/>
+        </w:rPr>
+        <w:t>. This project is an opportunity for me to learn not only how a coding editor works, but also why the best ones are the way they are, along with me expanding my understanding of coding languages by choosing a language that I am not close to mastering and allowing me to learn it through this project in able to expand my portfolio of coding languages for in the future. This editor aims to help coders who want</w:t>
+      </w:r>
+      <w:r>
+        <w:rPr>
+          <w:rFonts w:ascii="Calibri" w:hAnsi="Calibri" w:cs="Calibri"/>
+          <w:color w:val="000000"/>
+        </w:rPr>
+        <w:t xml:space="preserve"> to learn how to code as well as learning how to use Arduino and raspberry pi</w:t>
+      </w:r>
+      <w:r>
+        <w:rPr>
+          <w:rFonts w:ascii="Calibri" w:hAnsi="Calibri" w:cs="Calibri"/>
+          <w:color w:val="000000"/>
+        </w:rPr>
+        <w:t xml:space="preserve">, it is its own stand-alone app that can provide </w:t>
+      </w:r>
+      <w:proofErr w:type="gramStart"/>
+      <w:r>
+        <w:rPr>
+          <w:rFonts w:ascii="Calibri" w:hAnsi="Calibri" w:cs="Calibri"/>
+          <w:color w:val="000000"/>
+        </w:rPr>
+        <w:t>a</w:t>
+      </w:r>
+      <w:proofErr w:type="gramEnd"/>
+      <w:r>
+        <w:rPr>
+          <w:rFonts w:ascii="Calibri" w:hAnsi="Calibri" w:cs="Calibri"/>
+          <w:color w:val="000000"/>
+        </w:rPr>
+        <w:t xml:space="preserve"> easy to use and </w:t>
+      </w:r>
+      <w:r>
+        <w:rPr>
+          <w:rFonts w:ascii="Calibri" w:hAnsi="Calibri" w:cs="Calibri"/>
+          <w:color w:val="000000"/>
+        </w:rPr>
+        <w:t>intuitive interface to beginners to this area and allow them to learn through using the app</w:t>
+      </w:r>
+      <w:r>
+        <w:rPr>
+          <w:rFonts w:ascii="Calibri" w:hAnsi="Calibri" w:cs="Calibri"/>
+          <w:color w:val="000000"/>
+        </w:rPr>
+        <w:t xml:space="preserve">. </w:t>
+      </w:r>
+    </w:p>
+    <w:p>
+      <w:pPr>
+        <w:pStyle w:val="NormalWeb"/>
+        <w:spacing w:before="0" w:beforeAutospacing="0" w:after="0" w:afterAutospacing="0"/>
         <w:rPr>
           <w:rFonts w:ascii="Calibri" w:hAnsi="Calibri" w:cs="Calibri"/>
           <w:color w:val="000000"/>
           <w:sz w:val="28"/>
           <w:szCs w:val="28"/>
         </w:rPr>
-        <w:t xml:space="preserve">GoCode editor: A modal based coding editor that is written 100% in </w:t>
-      </w:r>
-      <w:r>
-        <w:rPr>
-          <w:rFonts w:ascii="Calibri" w:hAnsi="Calibri" w:cs="Calibri"/>
-          <w:color w:val="000000"/>
-          <w:sz w:val="28"/>
-          <w:szCs w:val="28"/>
-        </w:rPr>
-        <w:t>Golang</w:t>
-      </w:r>
-      <w:r>
-        <w:rPr>
-          <w:rFonts w:ascii="Calibri" w:hAnsi="Calibri" w:cs="Calibri"/>
-          <w:color w:val="000000"/>
-          <w:sz w:val="28"/>
-          <w:szCs w:val="28"/>
-        </w:rPr>
-        <w:t xml:space="preserve">. This project is an opportunity for me to learn not only how a coding editor works, but also why the best ones are the way they are, along with me expanding my understanding of coding languages by choosing a language that I am not close to mastering and allowing me to learn it through this project in able to expand my portfolio of coding languages for in the future. This editor aims to help coders who want a modal editor such as neovim, but rather than it being in the terminal, it is its own stand-alone app that can provide necessities such as syntax highlighting and some debugging support natively. </w:t>
-      </w:r>
-    </w:p>
-    <w:p>
-      <w:pPr>
-        <w:pStyle w:val="NormalWeb"/>
-        <w:spacing w:before="0" w:beforeAutospacing="0" w:after="0" w:afterAutospacing="0"/>
-        <w:rPr>
-          <w:rFonts w:ascii="Calibri" w:hAnsi="Calibri" w:cs="Calibri"/>
-          <w:color w:val="000000"/>
-          <w:sz w:val="28"/>
-          <w:szCs w:val="28"/>
-        </w:rPr>
       </w:pPr>
     </w:p>
     <w:p>
@@ -582,7 +951,7 @@
           <w:color w:val="000000" w:themeColor="text1"/>
         </w:rPr>
       </w:pPr>
-      <w:bookmarkStart w:id="1" w:name="_Toc208391582"/>
+      <w:bookmarkStart w:id="1" w:name="_Toc209599358"/>
       <w:r>
         <w:rPr>
           <w:color w:val="000000" w:themeColor="text1"/>
@@ -623,21 +992,50 @@
         <w:t xml:space="preserve">, which will benefit me in the future. </w:t>
       </w:r>
     </w:p>
+    <w:p/>
     <w:p>
       <w:pPr>
         <w:pStyle w:val="Heading1"/>
         <w:rPr>
+          <w:color w:val="auto"/>
+        </w:rPr>
+      </w:pPr>
+      <w:bookmarkStart w:id="2" w:name="_Toc209599359"/>
+      <w:r>
+        <w:rPr>
+          <w:color w:val="auto"/>
+        </w:rPr>
+        <w:lastRenderedPageBreak/>
+        <w:t>Research</w:t>
+      </w:r>
+      <w:bookmarkEnd w:id="2"/>
+    </w:p>
+    <w:p>
+      <w:pPr>
+        <w:pStyle w:val="Heading2"/>
+        <w:rPr>
           <w:color w:val="000000" w:themeColor="text1"/>
         </w:rPr>
       </w:pPr>
-      <w:bookmarkStart w:id="2" w:name="_Toc208391583"/>
+      <w:bookmarkStart w:id="3" w:name="_Toc209599360"/>
       <w:r>
         <w:rPr>
           <w:color w:val="000000" w:themeColor="text1"/>
         </w:rPr>
-        <w:t>Research</w:t>
-      </w:r>
-      <w:bookmarkEnd w:id="2"/>
+        <w:t>Outlook</w:t>
+      </w:r>
+      <w:bookmarkEnd w:id="3"/>
+      <w:r>
+        <w:rPr>
+          <w:color w:val="000000" w:themeColor="text1"/>
+        </w:rPr>
+        <w:t xml:space="preserve"> </w:t>
+      </w:r>
+    </w:p>
+    <w:p>
+      <w:r>
+        <w:t xml:space="preserve">I believe this project will challenge me to work and understand how coding editors work and what components are needed within an editors to get them to work. This will allow me to use a computational approach to decompose the project down into approachable sections that I can work on and recombine to make a full working prototype. The project will require me to do deeper research into how individual component of a coding editor works and what each piece will need to be functional and how they will work together. </w:t>
+      </w:r>
     </w:p>
     <w:p>
       <w:pPr>
@@ -646,41 +1044,14 @@
           <w:color w:val="000000" w:themeColor="text1"/>
         </w:rPr>
       </w:pPr>
-      <w:bookmarkStart w:id="3" w:name="_Toc208391584"/>
+      <w:bookmarkStart w:id="4" w:name="_Toc209599361"/>
       <w:r>
         <w:rPr>
           <w:color w:val="000000" w:themeColor="text1"/>
         </w:rPr>
-        <w:t>Outlook</w:t>
-      </w:r>
-      <w:bookmarkEnd w:id="3"/>
-      <w:r>
-        <w:rPr>
-          <w:color w:val="000000" w:themeColor="text1"/>
-        </w:rPr>
-        <w:t xml:space="preserve"> </w:t>
-      </w:r>
-    </w:p>
-    <w:p>
-      <w:r>
-        <w:t xml:space="preserve">I believe this project will challenge me to work and understand how coding editors work and what components are needed within an editors to get them to work. This will allow me to use a computational approach to decompose the project down into approachable sections that I can work on and recombine to make a full working prototype. The project will require me to do deeper research into how individual component of a coding editor works and what each piece will need to be functional and how they will work together. </w:t>
-      </w:r>
-    </w:p>
-    <w:p>
-      <w:pPr>
-        <w:pStyle w:val="Heading2"/>
-        <w:rPr>
-          <w:color w:val="000000" w:themeColor="text1"/>
-        </w:rPr>
-      </w:pPr>
-      <w:bookmarkStart w:id="4" w:name="_Toc208391585"/>
-      <w:r>
-        <w:rPr>
-          <w:color w:val="000000" w:themeColor="text1"/>
-        </w:rPr>
-        <w:lastRenderedPageBreak/>
         <w:t>Pre-requisites</w:t>
       </w:r>
+      <w:bookmarkEnd w:id="4"/>
     </w:p>
     <w:p>
       <w:r>
@@ -717,7 +1088,7 @@
         </w:numPr>
       </w:pPr>
       <w:r>
-        <w:t>Shell for running/debugging</w:t>
+        <w:t>Access to filesystem to open/close/save files</w:t>
       </w:r>
     </w:p>
     <w:p>
@@ -729,7 +1100,34 @@
         </w:numPr>
       </w:pPr>
       <w:r>
-        <w:t>User installed languages</w:t>
+        <w:t xml:space="preserve">A way to compile </w:t>
+      </w:r>
+      <w:r>
+        <w:t xml:space="preserve">code written to work for an </w:t>
+      </w:r>
+      <w:r>
+        <w:t>Arduino</w:t>
+      </w:r>
+    </w:p>
+    <w:p>
+      <w:pPr>
+        <w:pStyle w:val="Heading2"/>
+        <w:rPr>
+          <w:color w:val="000000" w:themeColor="text1"/>
+        </w:rPr>
+      </w:pPr>
+      <w:bookmarkStart w:id="5" w:name="_Toc209599362"/>
+      <w:r>
+        <w:rPr>
+          <w:color w:val="000000" w:themeColor="text1"/>
+        </w:rPr>
+        <w:t>Features to include</w:t>
+      </w:r>
+      <w:bookmarkEnd w:id="5"/>
+    </w:p>
+    <w:p>
+      <w:r>
+        <w:t>The features I would like to include in my project include:</w:t>
       </w:r>
     </w:p>
     <w:p>
@@ -741,26 +1139,7 @@
         </w:numPr>
       </w:pPr>
       <w:r>
-        <w:t>Access to filesystem to open/close/save files</w:t>
-      </w:r>
-    </w:p>
-    <w:p>
-      <w:pPr>
-        <w:pStyle w:val="Heading2"/>
-        <w:rPr>
-          <w:color w:val="000000" w:themeColor="text1"/>
-        </w:rPr>
-      </w:pPr>
-      <w:r>
-        <w:rPr>
-          <w:color w:val="000000" w:themeColor="text1"/>
-        </w:rPr>
-        <w:t>Features to include</w:t>
-      </w:r>
-    </w:p>
-    <w:p>
-      <w:r>
-        <w:t>The features I would like to include in my project include:</w:t>
+        <w:t>GUI for ease of use</w:t>
       </w:r>
     </w:p>
     <w:p>
@@ -772,16 +1151,13 @@
         </w:numPr>
       </w:pPr>
       <w:r>
-        <w:t xml:space="preserve">Modes </w:t>
-      </w:r>
-      <w:r>
-        <w:t>–</w:t>
-      </w:r>
-      <w:r>
-        <w:t xml:space="preserve"> </w:t>
-      </w:r>
-      <w:r>
-        <w:t>Command/Edit</w:t>
+        <w:t xml:space="preserve">Inbuilt terminal to run/debug files using </w:t>
+      </w:r>
+      <w:r>
+        <w:t>language servers on users’ machine</w:t>
+      </w:r>
+      <w:r>
+        <w:t xml:space="preserve"> (future)</w:t>
       </w:r>
     </w:p>
     <w:p>
@@ -793,7 +1169,10 @@
         </w:numPr>
       </w:pPr>
       <w:r>
-        <w:t>GUI for ease of use</w:t>
+        <w:t>Debugging capabilities</w:t>
+      </w:r>
+      <w:r>
+        <w:t xml:space="preserve"> (future)</w:t>
       </w:r>
     </w:p>
     <w:p>
@@ -805,10 +1184,10 @@
         </w:numPr>
       </w:pPr>
       <w:r>
-        <w:t xml:space="preserve">Inbuilt terminal to run/debug files using </w:t>
-      </w:r>
-      <w:r>
-        <w:t>language servers on users’ machine</w:t>
+        <w:t xml:space="preserve">Commands to have </w:t>
+      </w:r>
+      <w:r>
+        <w:t>functionality</w:t>
       </w:r>
     </w:p>
     <w:p>
@@ -820,7 +1199,38 @@
         </w:numPr>
       </w:pPr>
       <w:r>
-        <w:t>Syntax highlighting to allow users to view code</w:t>
+        <w:t xml:space="preserve">Block based code </w:t>
+      </w:r>
+    </w:p>
+    <w:p>
+      <w:pPr>
+        <w:pStyle w:val="Heading2"/>
+        <w:rPr>
+          <w:color w:val="000000" w:themeColor="text1"/>
+        </w:rPr>
+      </w:pPr>
+      <w:bookmarkStart w:id="6" w:name="_Partials_solutions"/>
+      <w:bookmarkStart w:id="7" w:name="_Toc209599363"/>
+      <w:bookmarkEnd w:id="6"/>
+      <w:r>
+        <w:rPr>
+          <w:color w:val="000000" w:themeColor="text1"/>
+        </w:rPr>
+        <w:t>Partials solutions</w:t>
+      </w:r>
+      <w:bookmarkEnd w:id="7"/>
+    </w:p>
+    <w:p>
+      <w:r>
+        <w:t xml:space="preserve">There are a few partial solution that are </w:t>
+      </w:r>
+      <w:proofErr w:type="gramStart"/>
+      <w:r>
+        <w:t>similar to</w:t>
+      </w:r>
+      <w:proofErr w:type="gramEnd"/>
+      <w:r>
+        <w:t xml:space="preserve"> what I am trying to make, these include:</w:t>
       </w:r>
     </w:p>
     <w:p>
@@ -832,7 +1242,60 @@
         </w:numPr>
       </w:pPr>
       <w:r>
-        <w:t>Debugging capabilities</w:t>
+        <w:t xml:space="preserve">Zed, a rust based </w:t>
+      </w:r>
+      <w:proofErr w:type="spellStart"/>
+      <w:r>
+        <w:t>gui</w:t>
+      </w:r>
+      <w:proofErr w:type="spellEnd"/>
+      <w:r>
+        <w:t xml:space="preserve"> </w:t>
+      </w:r>
+      <w:r>
+        <w:t xml:space="preserve">editor </w:t>
+      </w:r>
+      <w:proofErr w:type="gramStart"/>
+      <w:r>
+        <w:t>similar to</w:t>
+      </w:r>
+      <w:proofErr w:type="gramEnd"/>
+      <w:r>
+        <w:t xml:space="preserve"> </w:t>
+      </w:r>
+      <w:proofErr w:type="spellStart"/>
+      <w:r>
+        <w:t>vscode</w:t>
+      </w:r>
+      <w:proofErr w:type="spellEnd"/>
+      <w:r>
+        <w:t xml:space="preserve">. </w:t>
+      </w:r>
+    </w:p>
+    <w:p>
+      <w:pPr>
+        <w:pStyle w:val="ListParagraph"/>
+      </w:pPr>
+      <w:r>
+        <w:t>Zed Industries. (16 June 2025). </w:t>
+      </w:r>
+      <w:r>
+        <w:rPr>
+          <w:i/>
+          <w:iCs/>
+        </w:rPr>
+        <w:t>Zed</w:t>
+      </w:r>
+      <w:r>
+        <w:t xml:space="preserve">. [Online]. </w:t>
+      </w:r>
+      <w:proofErr w:type="spellStart"/>
+      <w:r>
+        <w:t>zed.dev</w:t>
+      </w:r>
+      <w:proofErr w:type="spellEnd"/>
+      <w:r>
+        <w:t>. Last Updated: 10 September 2025. Available at: https://zed.dev/ [Accessed 18 September 2025].</w:t>
       </w:r>
     </w:p>
     <w:p>
@@ -844,10 +1307,46 @@
         </w:numPr>
       </w:pPr>
       <w:r>
-        <w:t xml:space="preserve">Commands to have </w:t>
-      </w:r>
-      <w:r>
-        <w:t>functionality</w:t>
+        <w:t xml:space="preserve">Helix, a </w:t>
+      </w:r>
+      <w:proofErr w:type="gramStart"/>
+      <w:r>
+        <w:t>text based</w:t>
+      </w:r>
+      <w:proofErr w:type="gramEnd"/>
+      <w:r>
+        <w:t xml:space="preserve"> coding editor written in rust, </w:t>
+      </w:r>
+      <w:proofErr w:type="gramStart"/>
+      <w:r>
+        <w:t>similar to</w:t>
+      </w:r>
+      <w:proofErr w:type="gramEnd"/>
+      <w:r>
+        <w:t xml:space="preserve"> </w:t>
+      </w:r>
+      <w:proofErr w:type="spellStart"/>
+      <w:r>
+        <w:t>vscode</w:t>
+      </w:r>
+      <w:proofErr w:type="spellEnd"/>
+    </w:p>
+    <w:p>
+      <w:pPr>
+        <w:pStyle w:val="ListParagraph"/>
+      </w:pPr>
+      <w:r>
+        <w:t>Michael Murphy. (12 May 2021). </w:t>
+      </w:r>
+      <w:r>
+        <w:rPr>
+          <w:i/>
+          <w:iCs/>
+        </w:rPr>
+        <w:t>Helix</w:t>
+      </w:r>
+      <w:r>
+        <w:t>. [Online]. helix-editor.com. Last Updated: 18 June 2025. Available at: https://helix-editor.com/ [Accessed 18 September 2025].</w:t>
       </w:r>
     </w:p>
     <w:p>
@@ -858,233 +1357,457 @@
           <w:numId w:val="2"/>
         </w:numPr>
       </w:pPr>
-      <w:r>
-        <w:t>Finding within files/finding within a directory (fuzzy finder)</w:t>
-      </w:r>
-    </w:p>
+      <w:proofErr w:type="spellStart"/>
+      <w:r>
+        <w:t>Blockly</w:t>
+      </w:r>
+      <w:proofErr w:type="spellEnd"/>
+      <w:r>
+        <w:t xml:space="preserve">, a </w:t>
+      </w:r>
+      <w:proofErr w:type="gramStart"/>
+      <w:r>
+        <w:t>block based</w:t>
+      </w:r>
+      <w:proofErr w:type="gramEnd"/>
+      <w:r>
+        <w:t xml:space="preserve"> code editor written by google</w:t>
+      </w:r>
+    </w:p>
+    <w:p>
+      <w:pPr>
+        <w:pStyle w:val="ListParagraph"/>
+      </w:pPr>
+      <w:r>
+        <w:lastRenderedPageBreak/>
+        <w:t>Google. (13 May 2012). </w:t>
+      </w:r>
+      <w:proofErr w:type="spellStart"/>
+      <w:r>
+        <w:rPr>
+          <w:i/>
+          <w:iCs/>
+        </w:rPr>
+        <w:t>Blockly</w:t>
+      </w:r>
+      <w:proofErr w:type="spellEnd"/>
+      <w:r>
+        <w:t>. [Online]. google.github.io/</w:t>
+      </w:r>
+      <w:proofErr w:type="spellStart"/>
+      <w:r>
+        <w:t>blockly</w:t>
+      </w:r>
+      <w:proofErr w:type="spellEnd"/>
+      <w:r>
+        <w:t>. Last Updated: 28 August 2025. Available at: https://google.github.io/blockly/ [Accessed 21 September 2025].</w:t>
+      </w:r>
+      <w:r>
+        <w:t xml:space="preserve"> </w:t>
+      </w:r>
+    </w:p>
+    <w:p/>
+    <w:p>
+      <w:r>
+        <w:t>All</w:t>
+      </w:r>
+      <w:r>
+        <w:t xml:space="preserve"> of these solutions use the </w:t>
+      </w:r>
+      <w:r>
+        <w:t>Rust</w:t>
+      </w:r>
+      <w:r>
+        <w:t xml:space="preserve"> programming language, which is what I am also choosing to use for this project as it will help me to expand my knowledge of coding and allow me to have multiple options for later in life if I choose to code, allowing me to expand my breadth in coding to have multiple options for completing a project. </w:t>
+      </w:r>
+      <w:r>
+        <w:t>Both</w:t>
+      </w:r>
+      <w:r>
+        <w:t xml:space="preserve"> solutions are text based, meaning that they only run in the terminal, whereas I would like to have this code editor as a GUI, so the interface is more useable to more people. </w:t>
+      </w:r>
+    </w:p>
+    <w:p/>
     <w:p>
       <w:pPr>
         <w:pStyle w:val="Heading2"/>
-      </w:pPr>
-    </w:p>
-    <w:p>
-      <w:pPr>
-        <w:pStyle w:val="Heading2"/>
         <w:rPr>
           <w:color w:val="000000" w:themeColor="text1"/>
         </w:rPr>
       </w:pPr>
+      <w:bookmarkStart w:id="8" w:name="_Toc209599364"/>
       <w:r>
         <w:rPr>
           <w:color w:val="000000" w:themeColor="text1"/>
         </w:rPr>
-        <w:t>Partials solutions</w:t>
-      </w:r>
-      <w:bookmarkEnd w:id="4"/>
-    </w:p>
-    <w:p>
-      <w:r>
-        <w:t>There are a few partial solution that are similar to what I am trying to make, these include:</w:t>
-      </w:r>
-    </w:p>
-    <w:p>
-      <w:pPr>
-        <w:pStyle w:val="NormalWeb"/>
+        <w:t>Libraries</w:t>
+      </w:r>
+      <w:bookmarkEnd w:id="8"/>
+    </w:p>
+    <w:p>
+      <w:r>
+        <w:t xml:space="preserve">To make the program a GUI I have decided to look for multiple window libraries within the </w:t>
+      </w:r>
+      <w:r>
+        <w:t>rust</w:t>
+      </w:r>
+      <w:r>
+        <w:t xml:space="preserve"> ecosystem.</w:t>
+      </w:r>
+      <w:r>
+        <w:t xml:space="preserve"> These libraries would allow me to </w:t>
+      </w:r>
+      <w:r>
+        <w:t xml:space="preserve">produce a GUI that will serve as the basis for my </w:t>
+      </w:r>
+      <w:r>
+        <w:t>code editor</w:t>
+      </w:r>
+      <w:r>
+        <w:t>. The window library will need</w:t>
+      </w:r>
+      <w:r>
+        <w:t>:</w:t>
+      </w:r>
+    </w:p>
+    <w:p>
+      <w:pPr>
+        <w:pStyle w:val="ListParagraph"/>
         <w:numPr>
           <w:ilvl w:val="0"/>
           <w:numId w:val="1"/>
         </w:numPr>
-        <w:spacing w:before="0" w:beforeAutospacing="0" w:after="0" w:afterAutospacing="0"/>
-        <w:rPr>
-          <w:rFonts w:ascii="Calibri" w:hAnsi="Calibri" w:cs="Calibri"/>
-          <w:sz w:val="22"/>
-          <w:szCs w:val="22"/>
-        </w:rPr>
-      </w:pPr>
-      <w:r>
-        <w:rPr>
-          <w:rFonts w:ascii="Calibri" w:hAnsi="Calibri" w:cs="Calibri"/>
-          <w:sz w:val="22"/>
-          <w:szCs w:val="22"/>
-        </w:rPr>
-        <w:t xml:space="preserve">Micro: a text based coding editor </w:t>
-      </w:r>
-    </w:p>
-    <w:p>
-      <w:pPr>
-        <w:pStyle w:val="NormalWeb"/>
-        <w:spacing w:before="0" w:beforeAutospacing="0" w:after="0" w:afterAutospacing="0"/>
-        <w:ind w:left="720"/>
-        <w:rPr>
-          <w:rFonts w:ascii="Calibri" w:hAnsi="Calibri" w:cs="Calibri"/>
-          <w:sz w:val="22"/>
-          <w:szCs w:val="22"/>
-        </w:rPr>
-      </w:pPr>
-      <w:r>
-        <w:rPr>
-          <w:rFonts w:ascii="Calibri" w:hAnsi="Calibri" w:cs="Calibri"/>
-          <w:sz w:val="22"/>
-          <w:szCs w:val="22"/>
-        </w:rPr>
-        <w:t>Zachary Yedidia. (Aug 27, 2016). </w:t>
-      </w:r>
-      <w:r>
-        <w:rPr>
-          <w:rFonts w:ascii="Noto Sans" w:hAnsi="Noto Sans" w:cs="Noto Sans"/>
-          <w:i/>
-          <w:iCs/>
-        </w:rPr>
-        <w:t>Micro</w:t>
-      </w:r>
-      <w:r>
-        <w:rPr>
-          <w:rFonts w:ascii="Calibri" w:hAnsi="Calibri" w:cs="Calibri"/>
-          <w:sz w:val="22"/>
-          <w:szCs w:val="22"/>
-        </w:rPr>
-        <w:t xml:space="preserve">. [Online]. github.com. Last Updated: Aug 27, 2024. Available at: </w:t>
-      </w:r>
-      <w:hyperlink r:id="rId6" w:history="1">
-        <w:r>
-          <w:rPr>
-            <w:rStyle w:val="Hyperlink"/>
-            <w:rFonts w:ascii="Calibri" w:eastAsiaTheme="majorEastAsia" w:hAnsi="Calibri" w:cs="Calibri"/>
-            <w:sz w:val="22"/>
-            <w:szCs w:val="22"/>
-          </w:rPr>
-          <w:t>https://github.com/zyedidia/micro</w:t>
-        </w:r>
-      </w:hyperlink>
-      <w:r>
-        <w:rPr>
-          <w:rFonts w:ascii="Calibri" w:hAnsi="Calibri" w:cs="Calibri"/>
-          <w:sz w:val="22"/>
-          <w:szCs w:val="22"/>
-        </w:rPr>
-        <w:t xml:space="preserve"> [Accessed 25 August 2025].</w:t>
-      </w:r>
-    </w:p>
-    <w:p>
-      <w:pPr>
-        <w:pStyle w:val="NormalWeb"/>
+      </w:pPr>
+      <w:r>
+        <w:t xml:space="preserve">to have the ability to create a menu to perform certain functions </w:t>
+      </w:r>
+    </w:p>
+    <w:p>
+      <w:pPr>
+        <w:pStyle w:val="ListParagraph"/>
         <w:numPr>
           <w:ilvl w:val="0"/>
           <w:numId w:val="1"/>
         </w:numPr>
-        <w:spacing w:before="0" w:beforeAutospacing="0" w:after="0" w:afterAutospacing="0"/>
-        <w:rPr>
-          <w:rFonts w:ascii="Calibri" w:hAnsi="Calibri" w:cs="Calibri"/>
-          <w:color w:val="000000"/>
-        </w:rPr>
-      </w:pPr>
-      <w:r>
-        <w:rPr>
-          <w:rFonts w:ascii="Calibri" w:hAnsi="Calibri" w:cs="Calibri"/>
-          <w:color w:val="000000"/>
-        </w:rPr>
-        <w:t xml:space="preserve">Tide: a TUI terminal based </w:t>
-      </w:r>
-    </w:p>
-    <w:p>
-      <w:pPr>
-        <w:pStyle w:val="NormalWeb"/>
-        <w:spacing w:before="0" w:beforeAutospacing="0" w:after="0" w:afterAutospacing="0"/>
-        <w:ind w:left="720"/>
-        <w:rPr>
-          <w:rFonts w:ascii="Calibri" w:hAnsi="Calibri" w:cs="Calibri"/>
-          <w:color w:val="000000"/>
-        </w:rPr>
-      </w:pPr>
-      <w:r>
-        <w:rPr>
-          <w:rFonts w:ascii="Calibri" w:hAnsi="Calibri" w:cs="Calibri"/>
-          <w:color w:val="000000"/>
-        </w:rPr>
-        <w:t>bethropolis. (April 9th 2025). </w:t>
-      </w:r>
-      <w:r>
-        <w:rPr>
-          <w:rFonts w:ascii="Calibri" w:hAnsi="Calibri" w:cs="Calibri"/>
+      </w:pPr>
+      <w:r>
+        <w:t xml:space="preserve">being able to </w:t>
+      </w:r>
+      <w:r>
+        <w:t>accept keyboard input for the command mode</w:t>
+      </w:r>
+    </w:p>
+    <w:p>
+      <w:pPr>
+        <w:pStyle w:val="ListParagraph"/>
+        <w:numPr>
+          <w:ilvl w:val="0"/>
+          <w:numId w:val="1"/>
+        </w:numPr>
+      </w:pPr>
+      <w:proofErr w:type="gramStart"/>
+      <w:r>
+        <w:t>Have the ability to</w:t>
+      </w:r>
+      <w:proofErr w:type="gramEnd"/>
+      <w:r>
+        <w:t xml:space="preserve"> create </w:t>
+      </w:r>
+      <w:proofErr w:type="spellStart"/>
+      <w:proofErr w:type="gramStart"/>
+      <w:r>
+        <w:t>a</w:t>
+      </w:r>
+      <w:proofErr w:type="spellEnd"/>
+      <w:proofErr w:type="gramEnd"/>
+      <w:r>
+        <w:t xml:space="preserve"> area that serves as the </w:t>
+      </w:r>
+      <w:r>
+        <w:t>editor where code is opened and edited</w:t>
+      </w:r>
+    </w:p>
+    <w:p>
+      <w:r>
+        <w:t xml:space="preserve">By searching for </w:t>
+      </w:r>
+      <w:r>
+        <w:t>Rust</w:t>
+      </w:r>
+      <w:r>
+        <w:t xml:space="preserve"> Gui libraries, I have narrowed it down to:</w:t>
+      </w:r>
+    </w:p>
+    <w:p>
+      <w:pPr>
+        <w:pStyle w:val="ListParagraph"/>
+        <w:numPr>
+          <w:ilvl w:val="0"/>
+          <w:numId w:val="1"/>
+        </w:numPr>
+      </w:pPr>
+      <w:bookmarkStart w:id="9" w:name="_Toc209173205"/>
+      <w:r>
+        <w:t>Egui</w:t>
+      </w:r>
+      <w:r>
+        <w:t xml:space="preserve">, a </w:t>
+      </w:r>
+      <w:r>
+        <w:t>window framework centred around simplicity and portability</w:t>
+      </w:r>
+      <w:bookmarkEnd w:id="9"/>
+    </w:p>
+    <w:p>
+      <w:pPr>
+        <w:pStyle w:val="ListParagraph"/>
+        <w:numPr>
+          <w:ilvl w:val="0"/>
+          <w:numId w:val="1"/>
+        </w:numPr>
+      </w:pPr>
+      <w:r>
+        <w:t xml:space="preserve">Slint, a rust native window library that </w:t>
+      </w:r>
+      <w:r>
+        <w:t>is used a lot for embedded devices</w:t>
+      </w:r>
+    </w:p>
+    <w:p>
+      <w:pPr>
+        <w:pStyle w:val="ListParagraph"/>
+        <w:numPr>
+          <w:ilvl w:val="0"/>
+          <w:numId w:val="1"/>
+        </w:numPr>
+      </w:pPr>
+      <w:proofErr w:type="spellStart"/>
+      <w:r>
+        <w:t>Gtk-rs</w:t>
+      </w:r>
+      <w:proofErr w:type="spellEnd"/>
+      <w:r>
+        <w:t xml:space="preserve">, a rust port of the well know </w:t>
+      </w:r>
+      <w:proofErr w:type="spellStart"/>
+      <w:r>
+        <w:t>gtk</w:t>
+      </w:r>
+      <w:proofErr w:type="spellEnd"/>
+      <w:r>
+        <w:t xml:space="preserve"> framework, this allows for the power of the </w:t>
+      </w:r>
+      <w:proofErr w:type="spellStart"/>
+      <w:r>
+        <w:t>gtk</w:t>
+      </w:r>
+      <w:proofErr w:type="spellEnd"/>
+      <w:r>
+        <w:t xml:space="preserve"> framework to be used by rust</w:t>
+      </w:r>
+      <w:r>
+        <w:tab/>
+      </w:r>
+      <w:r>
+        <w:tab/>
+      </w:r>
+    </w:p>
+    <w:p/>
+    <w:p>
+      <w:pPr>
+        <w:pStyle w:val="Heading2"/>
+        <w:rPr>
+          <w:color w:val="auto"/>
+        </w:rPr>
+      </w:pPr>
+      <w:bookmarkStart w:id="10" w:name="_Toc209599365"/>
+      <w:r>
+        <w:rPr>
+          <w:color w:val="auto"/>
+        </w:rPr>
+        <w:t>Stakeholders</w:t>
+      </w:r>
+      <w:bookmarkEnd w:id="10"/>
+    </w:p>
+    <w:p>
+      <w:r>
+        <w:t xml:space="preserve">For my stakeholders </w:t>
+      </w:r>
+      <w:r>
+        <w:t>I have</w:t>
+      </w:r>
+      <w:r>
+        <w:t xml:space="preserve"> chosen </w:t>
+      </w:r>
+      <w:r>
+        <w:t>to contact the</w:t>
+      </w:r>
+      <w:r>
+        <w:t xml:space="preserve"> head of DT at my school, I have chosen to contact him as </w:t>
+      </w:r>
+      <w:proofErr w:type="spellStart"/>
+      <w:r>
+        <w:t>i</w:t>
+      </w:r>
+      <w:proofErr w:type="spellEnd"/>
+      <w:r>
+        <w:t xml:space="preserve"> feel this project</w:t>
+      </w:r>
+    </w:p>
+    <w:p>
+      <w:pPr>
+        <w:pStyle w:val="Heading1"/>
+        <w:rPr>
+          <w:color w:val="auto"/>
+        </w:rPr>
+      </w:pPr>
+    </w:p>
+    <w:p>
+      <w:pPr>
+        <w:pStyle w:val="Heading1"/>
+        <w:rPr>
+          <w:color w:val="auto"/>
+        </w:rPr>
+      </w:pPr>
+      <w:bookmarkStart w:id="11" w:name="_Toc209599366"/>
+      <w:r>
+        <w:rPr>
+          <w:color w:val="auto"/>
+        </w:rPr>
+        <w:t>References</w:t>
+      </w:r>
+      <w:r>
+        <w:rPr>
+          <w:color w:val="auto"/>
+        </w:rPr>
+        <w:t>:</w:t>
+      </w:r>
+      <w:bookmarkEnd w:id="11"/>
+    </w:p>
+    <w:p>
+      <w:r>
+        <w:t>Zed Industries. (16 June 2025). </w:t>
+      </w:r>
+      <w:r>
+        <w:rPr>
           <w:i/>
           <w:iCs/>
-          <w:color w:val="000000"/>
-        </w:rPr>
-        <w:t>Tide</w:t>
-      </w:r>
-      <w:r>
-        <w:rPr>
-          <w:rFonts w:ascii="Calibri" w:hAnsi="Calibri" w:cs="Calibri"/>
-          <w:color w:val="000000"/>
-        </w:rPr>
-        <w:t xml:space="preserve">. [Online]. github.com. Last Updated: April 13th 2025. Available at: </w:t>
-      </w:r>
-      <w:hyperlink r:id="rId7" w:history="1">
-        <w:r>
-          <w:rPr>
-            <w:rStyle w:val="Hyperlink"/>
-            <w:rFonts w:ascii="Calibri" w:hAnsi="Calibri" w:cs="Calibri"/>
-          </w:rPr>
-          <w:t>https://github.com/bethropolis/tide</w:t>
-        </w:r>
-      </w:hyperlink>
-      <w:r>
-        <w:rPr>
-          <w:rFonts w:ascii="Calibri" w:hAnsi="Calibri" w:cs="Calibri"/>
-          <w:color w:val="000000"/>
-        </w:rPr>
-        <w:t xml:space="preserve"> [Accessed 25 August 2025].</w:t>
+        </w:rPr>
+        <w:t>Zed</w:t>
+      </w:r>
+      <w:r>
+        <w:t xml:space="preserve">. [Online]. </w:t>
+      </w:r>
+      <w:proofErr w:type="spellStart"/>
+      <w:r>
+        <w:t>zed.dev</w:t>
+      </w:r>
+      <w:proofErr w:type="spellEnd"/>
+      <w:r>
+        <w:t>. Last Updated: 10 September 2025. Available at: https://zed.dev/ [Accessed 18 September 2025].</w:t>
+      </w:r>
+    </w:p>
+    <w:p>
+      <w:r>
+        <w:lastRenderedPageBreak/>
+        <w:t>Michael Murphy. (12 May 2021). </w:t>
+      </w:r>
+      <w:r>
+        <w:rPr>
+          <w:i/>
+          <w:iCs/>
+        </w:rPr>
+        <w:t>Helix</w:t>
+      </w:r>
+      <w:r>
+        <w:t>. [Online]. helix-editor.com. Last Updated: 18 June 2025. Available at: https://helix-editor.com/ [Accessed 18 September 2025].</w:t>
+      </w:r>
+    </w:p>
+    <w:p>
+      <w:r>
+        <w:t xml:space="preserve"> </w:t>
+      </w:r>
+      <w:r>
+        <w:t>Google. (13 May 2012). </w:t>
+      </w:r>
+      <w:proofErr w:type="spellStart"/>
+      <w:r>
+        <w:rPr>
+          <w:i/>
+          <w:iCs/>
+        </w:rPr>
+        <w:t>Blockly</w:t>
+      </w:r>
+      <w:proofErr w:type="spellEnd"/>
+      <w:r>
+        <w:t>. [Online]. google.github.io/</w:t>
+      </w:r>
+      <w:proofErr w:type="spellStart"/>
+      <w:r>
+        <w:t>blockly</w:t>
+      </w:r>
+      <w:proofErr w:type="spellEnd"/>
+      <w:r>
+        <w:t>. Last Updated: 28 August 2025. Available at: https://google.github.io/blockly/ [Accessed 21 September 2025].</w:t>
+      </w:r>
+      <w:r>
+        <w:t xml:space="preserve"> </w:t>
       </w:r>
     </w:p>
     <w:p/>
     <w:p>
       <w:r>
-        <w:t xml:space="preserve">Both of these solutions use the </w:t>
-      </w:r>
-      <w:r>
-        <w:t>Golang</w:t>
-      </w:r>
-      <w:r>
-        <w:t xml:space="preserve"> programming language, which is what I am also choosing to use for this project as it will help me to expand my knowledge of coding and allow me to have multiple options for later in life if I choose to code, allowing me to expand my breadth in coding to have multiple options for completing a project. </w:t>
-      </w:r>
-      <w:r>
-        <w:t>Both</w:t>
-      </w:r>
-      <w:r>
-        <w:t xml:space="preserve"> solutions are text based, meaning that they only run in the terminal, whereas I would like to have this code editor as a GUI, so the interface is more useable to more people. </w:t>
+        <w:t>What need doing:</w:t>
+      </w:r>
+    </w:p>
+    <w:p>
+      <w:pPr>
+        <w:pStyle w:val="ListParagraph"/>
+        <w:numPr>
+          <w:ilvl w:val="0"/>
+          <w:numId w:val="1"/>
+        </w:numPr>
+      </w:pPr>
+      <w:r>
+        <w:t xml:space="preserve">Email </w:t>
+      </w:r>
+      <w:proofErr w:type="spellStart"/>
+      <w:r>
+        <w:t>mr</w:t>
+      </w:r>
+      <w:proofErr w:type="spellEnd"/>
+      <w:r>
+        <w:t xml:space="preserve"> turner about stakeholders </w:t>
+      </w:r>
+    </w:p>
+    <w:p>
+      <w:pPr>
+        <w:pStyle w:val="ListParagraph"/>
+        <w:numPr>
+          <w:ilvl w:val="0"/>
+          <w:numId w:val="1"/>
+        </w:numPr>
+      </w:pPr>
+      <w:r>
+        <w:t xml:space="preserve">Speak to </w:t>
+      </w:r>
+      <w:proofErr w:type="spellStart"/>
+      <w:r>
+        <w:t>mr</w:t>
+      </w:r>
+      <w:proofErr w:type="spellEnd"/>
+      <w:r>
+        <w:t xml:space="preserve"> major about project as I am confused</w:t>
       </w:r>
     </w:p>
     <w:p/>
-    <w:p>
-      <w:pPr>
-        <w:pStyle w:val="Heading2"/>
-        <w:rPr>
-          <w:color w:val="000000" w:themeColor="text1"/>
-        </w:rPr>
-      </w:pPr>
-      <w:r>
-        <w:rPr>
-          <w:color w:val="000000" w:themeColor="text1"/>
-        </w:rPr>
-        <w:lastRenderedPageBreak/>
-        <w:t>Libraries</w:t>
-      </w:r>
-    </w:p>
-    <w:p>
-      <w:r>
-        <w:t xml:space="preserve">To make the program a GUI I have decided to look for multiple window libraries within the </w:t>
-      </w:r>
-      <w:r>
-        <w:t>Golang</w:t>
-      </w:r>
-      <w:r>
-        <w:t xml:space="preserve"> ecosystem. </w:t>
-      </w:r>
-      <w:r>
-        <w:tab/>
-      </w:r>
-    </w:p>
     <w:p/>
+    <w:p/>
+    <w:p>
+      <w:r>
+        <w:br w:type="page"/>
+      </w:r>
+    </w:p>
     <w:sectPr>
       <w:pgSz w:w="11906" w:h="16838"/>
       <w:pgMar w:top="1440" w:right="1440" w:bottom="1440" w:left="1440" w:header="708" w:footer="708" w:gutter="0"/>
@@ -1781,7 +2504,6 @@
     <w:next w:val="Normal"/>
     <w:link w:val="Heading3Char"/>
     <w:uiPriority w:val="9"/>
-    <w:semiHidden/>
     <w:unhideWhenUsed/>
     <w:qFormat/>
     <w:rsid w:val="00C03EB4"/>
@@ -1988,7 +2710,6 @@
     <w:basedOn w:val="DefaultParagraphFont"/>
     <w:link w:val="Heading3"/>
     <w:uiPriority w:val="9"/>
-    <w:semiHidden/>
     <w:rsid w:val="00C03EB4"/>
     <w:rPr>
       <w:rFonts w:eastAsiaTheme="majorEastAsia" w:cstheme="majorBidi"/>
@@ -2317,6 +3038,43 @@
     <w:pPr>
       <w:spacing w:after="100"/>
       <w:ind w:left="240"/>
+    </w:pPr>
+  </w:style>
+  <w:style w:type="character" w:styleId="UnresolvedMention">
+    <w:name w:val="Unresolved Mention"/>
+    <w:basedOn w:val="DefaultParagraphFont"/>
+    <w:uiPriority w:val="99"/>
+    <w:semiHidden/>
+    <w:unhideWhenUsed/>
+    <w:rsid w:val="003453C3"/>
+    <w:rPr>
+      <w:color w:val="605E5C"/>
+      <w:shd w:val="clear" w:color="auto" w:fill="E1DFDD"/>
+    </w:rPr>
+  </w:style>
+  <w:style w:type="character" w:styleId="FollowedHyperlink">
+    <w:name w:val="FollowedHyperlink"/>
+    <w:basedOn w:val="DefaultParagraphFont"/>
+    <w:uiPriority w:val="99"/>
+    <w:semiHidden/>
+    <w:unhideWhenUsed/>
+    <w:rsid w:val="003453C3"/>
+    <w:rPr>
+      <w:color w:val="96607D" w:themeColor="followedHyperlink"/>
+      <w:u w:val="single"/>
+    </w:rPr>
+  </w:style>
+  <w:style w:type="paragraph" w:styleId="TOC3">
+    <w:name w:val="toc 3"/>
+    <w:basedOn w:val="Normal"/>
+    <w:next w:val="Normal"/>
+    <w:autoRedefine/>
+    <w:uiPriority w:val="39"/>
+    <w:unhideWhenUsed/>
+    <w:rsid w:val="00EA0429"/>
+    <w:pPr>
+      <w:spacing w:after="100"/>
+      <w:ind w:left="480"/>
     </w:pPr>
   </w:style>
 </w:styles>

</xml_diff>